<commit_message>
docs: tesis v01 con referencias IEEE y cuatro diagramas Mermaid (PNG) insertados en el capítulo 4
Co-Authored-By: Claude Sonnet 5 <noreply@anthropic.com>
</commit_message>
<xml_diff>
--- a/itz/tesis/Loom - Tesis v01.docx
+++ b/itz/tesis/Loom - Tesis v01.docx
@@ -10789,7 +10789,82 @@
         </w:p>
         <w:p>
           <w:r>
-            <w:t xml:space="preserve">[FIGURA 4.1 por insertar: arquitectura de alto nivel y flujo de la HU al despliegue (fuente: diagramas/00-arquitectura-alto-nivel.md y diagramas/01-flujo-pipeline-hu-a-desarrollo.md).]</w:t>
+            <w:t xml:space="preserve">La figura 4.1 resume el recorrido de una HU por las cuatro fases.</w:t>
+          </w:r>
+        </w:p>
+        <w:p>
+          <w:pPr>
+            <w:keepNext/>
+            <w:spacing w:before="120" w:after="60"/>
+            <w:ind w:firstLine="0"/>
+            <w:jc w:val="center"/>
+          </w:pPr>
+          <w:r>
+            <w:drawing>
+              <wp:inline distT="0" distB="0" distL="0" distR="0">
+                <wp:extent cx="5170110" cy="6120000"/>
+                <wp:docPr id="9001" name="Figura 4.1" descr="Flujo de una HU por las cuatro fases de Loom"/>
+                <a:graphic xmlns:a="http://schemas.openxmlformats.org/drawingml/2006/main">
+                  <a:graphicData uri="http://schemas.openxmlformats.org/drawingml/2006/picture">
+                    <pic:pic xmlns:pic="http://schemas.openxmlformats.org/drawingml/2006/picture">
+                      <pic:nvPicPr>
+                        <pic:cNvPr id="9001" name="loom_fig1.png"/>
+                        <pic:cNvPicPr/>
+                      </pic:nvPicPr>
+                      <pic:blipFill>
+                        <a:blip r:embed="rIdLoomFig1"/>
+                        <a:stretch>
+                          <a:fillRect/>
+                        </a:stretch>
+                      </pic:blipFill>
+                      <pic:spPr>
+                        <a:xfrm>
+                          <a:off x="0" y="0"/>
+                          <a:ext cx="5170110" cy="6120000"/>
+                        </a:xfrm>
+                        <a:prstGeom prst="rect">
+                          <a:avLst/>
+                        </a:prstGeom>
+                      </pic:spPr>
+                    </pic:pic>
+                  </a:graphicData>
+                </a:graphic>
+              </wp:inline>
+            </w:drawing>
+          </w:r>
+        </w:p>
+        <w:p>
+          <w:pPr>
+            <w:pStyle w:val="Caption"/>
+            <w:ind w:firstLine="0"/>
+            <w:jc w:val="center"/>
+            <w:rPr>
+              <w:b w:val="0"/>
+            </w:rPr>
+          </w:pPr>
+          <w:r>
+            <w:t>Figura 4.</w:t>
+          </w:r>
+          <w:r>
+            <w:fldChar w:fldCharType="begin"/>
+          </w:r>
+          <w:r>
+            <w:instrText xml:space="preserve"> SEQ Figura \s 1</w:instrText>
+          </w:r>
+          <w:r>
+            <w:fldChar w:fldCharType="separate"/>
+          </w:r>
+          <w:r>
+            <w:rPr>
+              <w:noProof/>
+            </w:rPr>
+            <w:t>1</w:t>
+          </w:r>
+          <w:r>
+            <w:fldChar w:fldCharType="end"/>
+          </w:r>
+          <w:r>
+            <w:t xml:space="preserve">. Flujo de una HU por las cuatro fases de Loom</w:t>
           </w:r>
         </w:p>
         <w:p>
@@ -10812,7 +10887,82 @@
         </w:p>
         <w:p>
           <w:r>
-            <w:t xml:space="preserve">La plataforma se implementó como monorepo con un servidor en Python (con validación de datos mediante Pydantic), MongoDB como base de datos documental y una interfaz web en Angular con la biblioteca PrimeNG [ADR-0031]. Los procesos largos informan su progreso con eventos enviados por el servidor (SSE), que la interfaz muestra en un panel de actividad. El acceso de las personas requiere inicio de sesión.</w:t>
+            <w:t xml:space="preserve">La plataforma se implementó como monorepo con un servidor en Python (con validación de datos mediante Pydantic), MongoDB como base de datos documental y una interfaz web en Angular con la biblioteca PrimeNG [ADR-0031]. Los procesos largos informan su progreso con eventos enviados por el servidor (SSE), que la interfaz muestra en un panel de actividad. El acceso de las personas requiere inicio de sesión. La figura 4.2 muestra los componentes y sus conexiones con los servicios externos.</w:t>
+          </w:r>
+        </w:p>
+        <w:p>
+          <w:pPr>
+            <w:keepNext/>
+            <w:spacing w:before="120" w:after="60"/>
+            <w:ind w:firstLine="0"/>
+            <w:jc w:val="center"/>
+          </w:pPr>
+          <w:r>
+            <w:drawing>
+              <wp:inline distT="0" distB="0" distL="0" distR="0">
+                <wp:extent cx="5400000" cy="2713775"/>
+                <wp:docPr id="9002" name="Figura 4.2" descr="Arquitectura de la plataforma y servicios externos"/>
+                <a:graphic xmlns:a="http://schemas.openxmlformats.org/drawingml/2006/main">
+                  <a:graphicData uri="http://schemas.openxmlformats.org/drawingml/2006/picture">
+                    <pic:pic xmlns:pic="http://schemas.openxmlformats.org/drawingml/2006/picture">
+                      <pic:nvPicPr>
+                        <pic:cNvPr id="9002" name="loom_fig2.png"/>
+                        <pic:cNvPicPr/>
+                      </pic:nvPicPr>
+                      <pic:blipFill>
+                        <a:blip r:embed="rIdLoomFig2"/>
+                        <a:stretch>
+                          <a:fillRect/>
+                        </a:stretch>
+                      </pic:blipFill>
+                      <pic:spPr>
+                        <a:xfrm>
+                          <a:off x="0" y="0"/>
+                          <a:ext cx="5400000" cy="2713775"/>
+                        </a:xfrm>
+                        <a:prstGeom prst="rect">
+                          <a:avLst/>
+                        </a:prstGeom>
+                      </pic:spPr>
+                    </pic:pic>
+                  </a:graphicData>
+                </a:graphic>
+              </wp:inline>
+            </w:drawing>
+          </w:r>
+        </w:p>
+        <w:p>
+          <w:pPr>
+            <w:pStyle w:val="Caption"/>
+            <w:ind w:firstLine="0"/>
+            <w:jc w:val="center"/>
+            <w:rPr>
+              <w:b w:val="0"/>
+            </w:rPr>
+          </w:pPr>
+          <w:r>
+            <w:t>Figura 4.</w:t>
+          </w:r>
+          <w:r>
+            <w:fldChar w:fldCharType="begin"/>
+          </w:r>
+          <w:r>
+            <w:instrText xml:space="preserve"> SEQ Figura \s 1</w:instrText>
+          </w:r>
+          <w:r>
+            <w:fldChar w:fldCharType="separate"/>
+          </w:r>
+          <w:r>
+            <w:rPr>
+              <w:noProof/>
+            </w:rPr>
+            <w:t>2</w:t>
+          </w:r>
+          <w:r>
+            <w:fldChar w:fldCharType="end"/>
+          </w:r>
+          <w:r>
+            <w:t xml:space="preserve">. Arquitectura de la plataforma y servicios externos</w:t>
           </w:r>
         </w:p>
         <w:p>
@@ -12037,7 +12187,87 @@
         </w:p>
         <w:p>
           <w:r>
-            <w:t xml:space="preserve">La revisión recibe el Pull Request y el contexto completo (especificación, casos de prueba, arquitectura aprobada y el resumen de la implementación). Cada observación lleva una fuente (criterio de aceptación, arquitectura, buenas prácticas, pruebas o seguridad), una severidad (bloqueante, mayor o menor) y, cuando aplica, archivo y línea, y se publica como comentario en el Pull Request. Si una HU tiene supuestos sin confirmar, el sistema agrega una observación bloqueante hasta que una persona registre su decisión.</w:t>
+            <w:t xml:space="preserve">La revisión recibe el Pull Request y el contexto completo (especificación, casos de prueba, arquitectura aprobada y el resumen de la implementación). Cada observación lleva una fuente (criterio de aceptación, arquitectura, buenas prácticas, pruebas o seguridad), una severidad (bloqueante, mayor o menor) y, cuando aplica, archivo y línea, y se publica como comentario en el Pull Request. La figura 4.3 resume el ciclo completo de un paquete, desde la generación hasta la fusión.</w:t>
+          </w:r>
+        </w:p>
+        <w:p>
+          <w:pPr>
+            <w:keepNext/>
+            <w:spacing w:before="120" w:after="60"/>
+            <w:ind w:firstLine="0"/>
+            <w:jc w:val="center"/>
+          </w:pPr>
+          <w:r>
+            <w:drawing>
+              <wp:inline distT="0" distB="0" distL="0" distR="0">
+                <wp:extent cx="3247620" cy="6120000"/>
+                <wp:docPr id="9003" name="Figura 4.3" descr="Ciclo de un paquete de trabajo: generación, compuertas, revisión, corrección y fusión"/>
+                <a:graphic xmlns:a="http://schemas.openxmlformats.org/drawingml/2006/main">
+                  <a:graphicData uri="http://schemas.openxmlformats.org/drawingml/2006/picture">
+                    <pic:pic xmlns:pic="http://schemas.openxmlformats.org/drawingml/2006/picture">
+                      <pic:nvPicPr>
+                        <pic:cNvPr id="9003" name="loom_fig3.png"/>
+                        <pic:cNvPicPr/>
+                      </pic:nvPicPr>
+                      <pic:blipFill>
+                        <a:blip r:embed="rIdLoomFig3"/>
+                        <a:stretch>
+                          <a:fillRect/>
+                        </a:stretch>
+                      </pic:blipFill>
+                      <pic:spPr>
+                        <a:xfrm>
+                          <a:off x="0" y="0"/>
+                          <a:ext cx="3247620" cy="6120000"/>
+                        </a:xfrm>
+                        <a:prstGeom prst="rect">
+                          <a:avLst/>
+                        </a:prstGeom>
+                      </pic:spPr>
+                    </pic:pic>
+                  </a:graphicData>
+                </a:graphic>
+              </wp:inline>
+            </w:drawing>
+          </w:r>
+        </w:p>
+        <w:p>
+          <w:pPr>
+            <w:pStyle w:val="Caption"/>
+            <w:ind w:firstLine="0"/>
+            <w:jc w:val="center"/>
+            <w:rPr>
+              <w:b w:val="0"/>
+            </w:rPr>
+          </w:pPr>
+          <w:r>
+            <w:t>Figura 4.</w:t>
+          </w:r>
+          <w:r>
+            <w:fldChar w:fldCharType="begin"/>
+          </w:r>
+          <w:r>
+            <w:instrText xml:space="preserve"> SEQ Figura \s 1</w:instrText>
+          </w:r>
+          <w:r>
+            <w:fldChar w:fldCharType="separate"/>
+          </w:r>
+          <w:r>
+            <w:rPr>
+              <w:noProof/>
+            </w:rPr>
+            <w:t>3</w:t>
+          </w:r>
+          <w:r>
+            <w:fldChar w:fldCharType="end"/>
+          </w:r>
+          <w:r>
+            <w:t xml:space="preserve">. Ciclo de un paquete de trabajo: generación, compuertas, revisión, corrección y fusión</w:t>
+          </w:r>
+        </w:p>
+        <w:p>
+          <w:r>
+            <w:t xml:space="preserve">Si una HU tiene supuestos sin confirmar, el sistema agrega una observación bloqueante hasta que una persona registre su decisión.</w:t>
           </w:r>
         </w:p>
         <w:p>
@@ -12184,7 +12414,82 @@
         </w:p>
         <w:p>
           <w:r>
-            <w:t xml:space="preserve">Las pruebas de humo recorren todos los casos de prueba de una HU cuando toda su ronda de paquetes está fusionada. Un modelo lee el código de la aplicación y los casos y escribe un guion de Playwright con las acciones y las verificaciones de cada caso; el guion se ejecuta contra el ambiente desplegado con la cuenta de prueba del rol que el caso requiere. Cuando un caso falla, un agente de navegador lo reproduce para distinguir un guion mal escrito de un fallo real de la aplicación. El resultado de cada caso es aprobado, fallido o bloqueado, y el informe con capturas queda como evidencia. Los casos fallidos pueden convertirse en paquetes de corrección que reingresan al ciclo de código y revisión.</w:t>
+            <w:t xml:space="preserve">Las pruebas de humo recorren todos los casos de prueba de una HU cuando toda su ronda de paquetes está fusionada. Un modelo lee el código de la aplicación y los casos y escribe un guion de Playwright con las acciones y las verificaciones de cada caso; el guion se ejecuta contra el ambiente desplegado con la cuenta de prueba del rol que el caso requiere. Cuando un caso falla, un agente de navegador lo reproduce para distinguir un guion mal escrito de un fallo real de la aplicación. El resultado de cada caso es aprobado, fallido o bloqueado, y el informe con capturas queda como evidencia. Los casos fallidos pueden convertirse en paquetes de corrección que reingresan al ciclo de código y revisión. La figura 4.4 muestra la secuencia del despliegue y de la validación.</w:t>
+          </w:r>
+        </w:p>
+        <w:p>
+          <w:pPr>
+            <w:keepNext/>
+            <w:spacing w:before="120" w:after="60"/>
+            <w:ind w:firstLine="0"/>
+            <w:jc w:val="center"/>
+          </w:pPr>
+          <w:r>
+            <w:drawing>
+              <wp:inline distT="0" distB="0" distL="0" distR="0">
+                <wp:extent cx="5400000" cy="3616071"/>
+                <wp:docPr id="9004" name="Figura 4.4" descr="Secuencia de liberación en la nube y validación funcional"/>
+                <a:graphic xmlns:a="http://schemas.openxmlformats.org/drawingml/2006/main">
+                  <a:graphicData uri="http://schemas.openxmlformats.org/drawingml/2006/picture">
+                    <pic:pic xmlns:pic="http://schemas.openxmlformats.org/drawingml/2006/picture">
+                      <pic:nvPicPr>
+                        <pic:cNvPr id="9004" name="loom_fig4.png"/>
+                        <pic:cNvPicPr/>
+                      </pic:nvPicPr>
+                      <pic:blipFill>
+                        <a:blip r:embed="rIdLoomFig4"/>
+                        <a:stretch>
+                          <a:fillRect/>
+                        </a:stretch>
+                      </pic:blipFill>
+                      <pic:spPr>
+                        <a:xfrm>
+                          <a:off x="0" y="0"/>
+                          <a:ext cx="5400000" cy="3616071"/>
+                        </a:xfrm>
+                        <a:prstGeom prst="rect">
+                          <a:avLst/>
+                        </a:prstGeom>
+                      </pic:spPr>
+                    </pic:pic>
+                  </a:graphicData>
+                </a:graphic>
+              </wp:inline>
+            </w:drawing>
+          </w:r>
+        </w:p>
+        <w:p>
+          <w:pPr>
+            <w:pStyle w:val="Caption"/>
+            <w:ind w:firstLine="0"/>
+            <w:jc w:val="center"/>
+            <w:rPr>
+              <w:b w:val="0"/>
+            </w:rPr>
+          </w:pPr>
+          <w:r>
+            <w:t>Figura 4.</w:t>
+          </w:r>
+          <w:r>
+            <w:fldChar w:fldCharType="begin"/>
+          </w:r>
+          <w:r>
+            <w:instrText xml:space="preserve"> SEQ Figura \s 1</w:instrText>
+          </w:r>
+          <w:r>
+            <w:fldChar w:fldCharType="separate"/>
+          </w:r>
+          <w:r>
+            <w:rPr>
+              <w:noProof/>
+            </w:rPr>
+            <w:t>4</w:t>
+          </w:r>
+          <w:r>
+            <w:fldChar w:fldCharType="end"/>
+          </w:r>
+          <w:r>
+            <w:t xml:space="preserve">. Secuencia de liberación en la nube y validación funcional</w:t>
           </w:r>
         </w:p>
         <w:p>

</xml_diff>